<commit_message>
Test Plan 3, Test Report 3, Requirements, User Document
All above are added/updated
</commit_message>
<xml_diff>
--- a/Documents/Shattered Protocols User Document.docx
+++ b/Documents/Shattered Protocols User Document.docx
@@ -1030,6 +1030,217 @@
           <w:szCs w:val="24"/>
         </w:rPr>
         <w:t> Information on how to reach customer support if needed.</w:t>
+      </w:r>
+    </w:p>
+    <w:p>
+      <w:pPr>
+        <w:ind w:left="720"/>
+        <w:rPr>
+          <w:rFonts w:ascii="Times New Roman" w:hAnsi="Times New Roman" w:cs="Times New Roman"/>
+          <w:i w:val="0"/>
+          <w:iCs w:val="0"/>
+          <w:sz w:val="24"/>
+          <w:szCs w:val="24"/>
+        </w:rPr>
+      </w:pPr>
+    </w:p>
+    <w:p>
+      <w:pPr>
+        <w:ind w:left="720"/>
+        <w:rPr>
+          <w:rFonts w:ascii="Times New Roman" w:hAnsi="Times New Roman" w:cs="Times New Roman"/>
+          <w:i w:val="0"/>
+          <w:iCs w:val="0"/>
+          <w:sz w:val="24"/>
+          <w:szCs w:val="24"/>
+        </w:rPr>
+      </w:pPr>
+    </w:p>
+    <w:p>
+      <w:pPr>
+        <w:ind w:left="720"/>
+        <w:rPr>
+          <w:rFonts w:ascii="Times New Roman" w:hAnsi="Times New Roman" w:cs="Times New Roman"/>
+          <w:i w:val="0"/>
+          <w:iCs w:val="0"/>
+          <w:sz w:val="24"/>
+          <w:szCs w:val="24"/>
+        </w:rPr>
+      </w:pPr>
+    </w:p>
+    <w:p>
+      <w:pPr>
+        <w:ind w:left="720"/>
+        <w:rPr>
+          <w:rFonts w:ascii="Times New Roman" w:hAnsi="Times New Roman" w:cs="Times New Roman"/>
+          <w:i w:val="0"/>
+          <w:iCs w:val="0"/>
+          <w:sz w:val="24"/>
+          <w:szCs w:val="24"/>
+        </w:rPr>
+      </w:pPr>
+    </w:p>
+    <w:p>
+      <w:pPr>
+        <w:ind w:left="720"/>
+        <w:rPr>
+          <w:rFonts w:ascii="Times New Roman" w:hAnsi="Times New Roman" w:cs="Times New Roman"/>
+          <w:i w:val="0"/>
+          <w:iCs w:val="0"/>
+          <w:sz w:val="24"/>
+          <w:szCs w:val="24"/>
+        </w:rPr>
+      </w:pPr>
+    </w:p>
+    <w:p>
+      <w:pPr>
+        <w:ind w:left="720"/>
+        <w:rPr>
+          <w:rFonts w:ascii="Times New Roman" w:hAnsi="Times New Roman" w:cs="Times New Roman"/>
+          <w:i w:val="0"/>
+          <w:iCs w:val="0"/>
+          <w:sz w:val="24"/>
+          <w:szCs w:val="24"/>
+        </w:rPr>
+      </w:pPr>
+    </w:p>
+    <w:p>
+      <w:pPr>
+        <w:ind w:left="720"/>
+        <w:rPr>
+          <w:rFonts w:ascii="Times New Roman" w:hAnsi="Times New Roman" w:cs="Times New Roman"/>
+          <w:i w:val="0"/>
+          <w:iCs w:val="0"/>
+          <w:sz w:val="24"/>
+          <w:szCs w:val="24"/>
+        </w:rPr>
+      </w:pPr>
+    </w:p>
+    <w:p>
+      <w:pPr>
+        <w:ind w:left="720"/>
+        <w:rPr>
+          <w:rFonts w:ascii="Times New Roman" w:hAnsi="Times New Roman" w:cs="Times New Roman"/>
+          <w:i w:val="0"/>
+          <w:iCs w:val="0"/>
+          <w:sz w:val="24"/>
+          <w:szCs w:val="24"/>
+        </w:rPr>
+      </w:pPr>
+    </w:p>
+    <w:p>
+      <w:pPr>
+        <w:ind w:left="720"/>
+        <w:rPr>
+          <w:rFonts w:ascii="Times New Roman" w:hAnsi="Times New Roman" w:cs="Times New Roman"/>
+          <w:i w:val="0"/>
+          <w:iCs w:val="0"/>
+          <w:sz w:val="24"/>
+          <w:szCs w:val="24"/>
+        </w:rPr>
+      </w:pPr>
+    </w:p>
+    <w:p>
+      <w:pPr>
+        <w:rPr>
+          <w:rFonts w:ascii="Times New Roman" w:hAnsi="Times New Roman" w:cs="Times New Roman"/>
+          <w:i w:val="0"/>
+          <w:iCs w:val="0"/>
+          <w:sz w:val="24"/>
+          <w:szCs w:val="24"/>
+        </w:rPr>
+      </w:pPr>
+      <w:r>
+        <w:rPr>
+          <w:rFonts w:ascii="Times New Roman" w:hAnsi="Times New Roman" w:cs="Times New Roman"/>
+          <w:i w:val="0"/>
+          <w:iCs w:val="0"/>
+          <w:sz w:val="24"/>
+          <w:szCs w:val="24"/>
+        </w:rPr>
+        <w:lastRenderedPageBreak/>
+        <w:t xml:space="preserve">V. </w:t>
+      </w:r>
+      <w:r>
+        <w:rPr>
+          <w:rFonts w:ascii="Times New Roman" w:hAnsi="Times New Roman" w:cs="Times New Roman"/>
+          <w:i w:val="0"/>
+          <w:iCs w:val="0"/>
+          <w:sz w:val="24"/>
+          <w:szCs w:val="24"/>
+        </w:rPr>
+        <w:t>Map</w:t>
+      </w:r>
+    </w:p>
+    <w:p>
+      <w:pPr>
+        <w:rPr>
+          <w:rFonts w:ascii="Times New Roman" w:hAnsi="Times New Roman" w:cs="Times New Roman"/>
+          <w:i w:val="0"/>
+          <w:iCs w:val="0"/>
+          <w:sz w:val="24"/>
+          <w:szCs w:val="24"/>
+        </w:rPr>
+      </w:pPr>
+      <w:r>
+        <w:rPr>
+          <w:rFonts w:ascii="Times New Roman" w:hAnsi="Times New Roman" w:cs="Times New Roman"/>
+          <w:i w:val="0"/>
+          <w:iCs w:val="0"/>
+          <w:noProof/>
+          <w:sz w:val="24"/>
+          <w:szCs w:val="24"/>
+        </w:rPr>
+        <w:drawing>
+          <wp:inline distT="0" distB="0" distL="0" distR="0" wp14:anchorId="43CEE7CA" wp14:editId="77AADCF8">
+            <wp:extent cx="5939790" cy="7682230"/>
+            <wp:effectExtent l="12700" t="12700" r="16510" b="13970"/>
+            <wp:docPr id="1933490770" name="Picture 1"/>
+            <wp:cNvGraphicFramePr>
+              <a:graphicFrameLocks xmlns:a="http://schemas.openxmlformats.org/drawingml/2006/main" noChangeAspect="1"/>
+            </wp:cNvGraphicFramePr>
+            <a:graphic xmlns:a="http://schemas.openxmlformats.org/drawingml/2006/main">
+              <a:graphicData uri="http://schemas.openxmlformats.org/drawingml/2006/picture">
+                <pic:pic xmlns:pic="http://schemas.openxmlformats.org/drawingml/2006/picture">
+                  <pic:nvPicPr>
+                    <pic:cNvPr id="0" name="Picture 1"/>
+                    <pic:cNvPicPr>
+                      <a:picLocks noChangeAspect="1" noChangeArrowheads="1"/>
+                    </pic:cNvPicPr>
+                  </pic:nvPicPr>
+                  <pic:blipFill>
+                    <a:blip r:embed="rId5">
+                      <a:extLst>
+                        <a:ext uri="{28A0092B-C50C-407E-A947-70E740481C1C}">
+                          <a14:useLocalDpi xmlns:a14="http://schemas.microsoft.com/office/drawing/2010/main" val="0"/>
+                        </a:ext>
+                      </a:extLst>
+                    </a:blip>
+                    <a:srcRect/>
+                    <a:stretch>
+                      <a:fillRect/>
+                    </a:stretch>
+                  </pic:blipFill>
+                  <pic:spPr bwMode="auto">
+                    <a:xfrm>
+                      <a:off x="0" y="0"/>
+                      <a:ext cx="5939790" cy="7682230"/>
+                    </a:xfrm>
+                    <a:prstGeom prst="rect">
+                      <a:avLst/>
+                    </a:prstGeom>
+                    <a:noFill/>
+                    <a:ln>
+                      <a:solidFill>
+                        <a:schemeClr val="tx1"/>
+                      </a:solidFill>
+                    </a:ln>
+                  </pic:spPr>
+                </pic:pic>
+              </a:graphicData>
+            </a:graphic>
+          </wp:inline>
+        </w:drawing>
       </w:r>
     </w:p>
     <w:p>

</xml_diff>

<commit_message>
Fixed a bunch of the strings and errors
strings updated, errors fixed, script and map updated, user guide updated
</commit_message>
<xml_diff>
--- a/Documents/Shattered Protocols User Document.docx
+++ b/Documents/Shattered Protocols User Document.docx
@@ -1192,10 +1192,10 @@
           <w:szCs w:val="24"/>
         </w:rPr>
         <w:drawing>
-          <wp:inline distT="0" distB="0" distL="0" distR="0" wp14:anchorId="43CEE7CA" wp14:editId="77AADCF8">
-            <wp:extent cx="5939790" cy="7682230"/>
-            <wp:effectExtent l="12700" t="12700" r="16510" b="13970"/>
-            <wp:docPr id="1933490770" name="Picture 1"/>
+          <wp:inline distT="0" distB="0" distL="0" distR="0" wp14:anchorId="62D08AC2" wp14:editId="0F94DA56">
+            <wp:extent cx="5937885" cy="7684770"/>
+            <wp:effectExtent l="0" t="0" r="0" b="0"/>
+            <wp:docPr id="1421140805" name="Picture 1"/>
             <wp:cNvGraphicFramePr>
               <a:graphicFrameLocks xmlns:a="http://schemas.openxmlformats.org/drawingml/2006/main" noChangeAspect="1"/>
             </wp:cNvGraphicFramePr>
@@ -1224,16 +1224,14 @@
                   <pic:spPr bwMode="auto">
                     <a:xfrm>
                       <a:off x="0" y="0"/>
-                      <a:ext cx="5939790" cy="7682230"/>
+                      <a:ext cx="5937885" cy="7684770"/>
                     </a:xfrm>
                     <a:prstGeom prst="rect">
                       <a:avLst/>
                     </a:prstGeom>
                     <a:noFill/>
                     <a:ln>
-                      <a:solidFill>
-                        <a:schemeClr val="tx1"/>
-                      </a:solidFill>
+                      <a:noFill/>
                     </a:ln>
                   </pic:spPr>
                 </pic:pic>

</xml_diff>